<commit_message>
Cite Mehra et al. and correct the research gap in the final report
</commit_message>
<xml_diff>
--- a/report/Final_Report.docx
+++ b/report/Final_Report.docx
@@ -2367,6 +2367,27 @@
     </w:p>
     <w:p>
       <w:pPr>
+        <w:jc w:val="both"/>
+      </w:pPr>
+      <w:r>
+        <w:rPr>
+          <w:rFonts w:ascii="Times New Roman" w:hAnsi="Times New Roman"/>
+          <w:b/>
+          <w:i w:val="0"/>
+        </w:rPr>
+        <w:t>Exits under distribution shift.</w:t>
+      </w:r>
+      <w:r>
+        <w:rPr>
+          <w:rFonts w:ascii="Times New Roman" w:hAnsi="Times New Roman"/>
+          <w:b w:val="0"/>
+          <w:i w:val="0"/>
+        </w:rPr>
+        <w:t xml:space="preserve"> Closest to our robustness study, Mehra et al. [17] evaluated SDN-style multi-exit VGG-16 and ResNet-56 models on CIFAR-10/100-C and found that the loss of calibration under corruption makes realistic exit strategies stop too early and misclassify more often; AugMix training reduced the effect.</w:t>
+      </w:r>
+    </w:p>
+    <w:p>
+      <w:pPr>
         <w:keepNext/>
         <w:spacing w:after="60" w:before="120"/>
       </w:pPr>
@@ -2390,7 +2411,7 @@
           <w:b w:val="0"/>
           <w:i w:val="0"/>
         </w:rPr>
-        <w:t>Most early-exit work decides with raw softmax confidence or entropy [1], [2], [4], [8], [9] without an explicit calibration step, although networks, and early exits in particular, are overconfident [5], [10]. Efficiency is mostly reported as FLOPs or exit depth [2]-[4], [8]-[10], although decision overhead can erase theoretical savings [6]. Finally, none of the reviewed early-exit methods studies how exit thresholds, exit distributions and calibration behave when inputs are corrupted [7]. This project addresses all three points on a common CIFAR-100 setup: it compares raw and calibrated exit rules, reports measured latency next to FLOPs, and evaluates every exit policy under noise, blur and contrast corruptions.</w:t>
+        <w:t>Most early-exit work decides with raw softmax confidence or entropy [1], [2], [4], [8], [9] without an explicit calibration step, although networks, and early exits in particular, are overconfident [5], [10]. Efficiency is mostly reported as FLOPs or exit depth [2]-[4], [8]-[10], although decision overhead can erase theoretical savings [6]. Mehra et al. [17] showed that exit decisions of SDN-style CNNs degrade under common corruptions, but how training choices such as self-distillation, transformer backbones and per-exit calibration change this behaviour, and how it relates to measured latency, has not been studied together. This project compares raw and calibrated exit rules on a CNN and a transformer, reports measured latency next to FLOPs, and evaluates every exit policy under noise, blur and contrast corruptions.</w:t>
       </w:r>
     </w:p>
     <w:p>
@@ -19181,7 +19202,7 @@
           <w:b w:val="0"/>
           <w:i w:val="0"/>
         </w:rPr>
-        <w:t>Our savings are in line with SDN [4], which reported more than 50% fewer FLOPs at equal accuracy on CIFAR-100, and our CPU speed-ups resemble the measured speed-ups of BranchyNet [1]. The missing GPU speed-up at batch 1 echoes BlockDrop's observation that sequential decisions can cost more than they save [6]. Like Meronen et al. [10] we find early exits miscalibrated; calibration improved routing for the underconfident ViT but not for the overconfident CNN on clean data, which we attribute to the threshold being shared across exits. Self-distillation, used by LGViT [9] to strengthen early exits, improved efficiency here but made the exits overconfident under corruption, an effect that the reviewed early-exit methods do not evaluate [7].</w:t>
+        <w:t>Our savings are in line with SDN [4], which reported more than 50% fewer FLOPs at equal accuracy on CIFAR-100, and our CPU speed-ups resemble the measured speed-ups of BranchyNet [1]. The missing GPU speed-up at batch 1 echoes BlockDrop's observation that sequential decisions can cost more than they save [6]. Like Meronen et al. [10] we find early exits miscalibrated; calibration improved routing for the underconfident ViT but not for the overconfident CNN on clean data, which we attribute to the threshold being shared across exits. Under corruption we confirm, for a ResNet-18 trained with our recipe, the finding of Mehra et al. [17] that miscalibration makes exits stop too early and misclassify. We add that self-distillation, used by LGViT [9] to strengthen early exits, amplifies this effect while improving clean efficiency, and that the underconfident exits of our ViT avoid it, although the ViT also differs in its training recipe.</w:t>
       </w:r>
     </w:p>
     <w:p>
@@ -19537,6 +19558,20 @@
           <w:sz w:val="19"/>
         </w:rPr>
         <w:t>[16] S. Yun, D. Han, S. J. Oh, S. Chun, J. Choe, and Y. Yoo, "CutMix: Regularization strategy to train strong classifiers with localizable features," in Proc. IEEE/CVF Int. Conf. Comput. Vis. (ICCV), 2019, pp. 6023-6032.</w:t>
+      </w:r>
+    </w:p>
+    <w:p>
+      <w:pPr>
+        <w:spacing w:after="40"/>
+      </w:pPr>
+      <w:r>
+        <w:rPr>
+          <w:rFonts w:ascii="Times New Roman" w:hAnsi="Times New Roman"/>
+          <w:b w:val="0"/>
+          <w:i w:val="0"/>
+          <w:sz w:val="19"/>
+        </w:rPr>
+        <w:t>[17] A. Mehra, S. Seto, N. Jaitly, and B.-J. Theobald, "Understanding the robustness of multi-exit models under common corruptions," arXiv:2212.01562, 2022.</w:t>
       </w:r>
     </w:p>
     <w:p>

</xml_diff>